<commit_message>
Restore Topics 5 and 6 to full length; rebuild all topics with wrapped answer-map notes
T5: KB 22,350 words (core 16,514; revision sheet 2,828 -> 3,802); seven new
sub-sections (higher education, Islamic principles in family law, groups at
the intersections, digital finance, political barriers, climate adaptation,
access to justice, neighbours' maternal-health lessons, health workforce,
provincial differences). Answers 987-1,039 -> 1,050-1,106; note 606.
T6: KB 22,214 words (core 16,535; sheet 1,959 -> 3,822); new sub-sections on
gender budgeting, suffrage arguments, provincial voting, FPTP vs PR, other
parliaments, measuring substantive representation, the civil service and
reform proposals. Answers 964-986 -> 1,051-1,061; note 599.
T1-T4 rebuilt so long answer-map notes wrap. SPEC rows updated.

Co-Authored-By: Claude Opus 5.5 <noreply@anthropic.com>
Claude-Session: https://claude.ai/code/session_012fTprSgerHUEq1SpU7USLW
</commit_message>
<xml_diff>
--- a/CSS Gender Studies/T2_Topic II — Feminist Theories and Practice/T2QA_Feminist Theories and Practice.docx
+++ b/CSS Gender Studies/T2_Topic II — Feminist Theories and Practice/T2QA_Feminist Theories and Practice.docx
@@ -1882,7 +1882,7 @@
       <w:r>
         <w:drawing>
           <wp:inline xmlns:a="http://schemas.openxmlformats.org/drawingml/2006/main" xmlns:pic="http://schemas.openxmlformats.org/drawingml/2006/picture">
-            <wp:extent cx="5943600" cy="4687339"/>
+            <wp:extent cx="5943600" cy="4754880"/>
             <wp:docPr id="1" name="Picture 1"/>
             <wp:cNvGraphicFramePr>
               <a:graphicFrameLocks noChangeAspect="1"/>
@@ -1891,7 +1891,7 @@
               <a:graphicData uri="http://schemas.openxmlformats.org/drawingml/2006/picture">
                 <pic:pic>
                   <pic:nvPicPr>
-                    <pic:cNvPr id="0" name="T2QA_mindmap_ab86e92e688a.png"/>
+                    <pic:cNvPr id="0" name="T2QA_mindmap_a4c1a6225842.png"/>
                     <pic:cNvPicPr/>
                   </pic:nvPicPr>
                   <pic:blipFill>
@@ -1903,7 +1903,7 @@
                   <pic:spPr>
                     <a:xfrm>
                       <a:off x="0" y="0"/>
-                      <a:ext cx="5943600" cy="4687339"/>
+                      <a:ext cx="5943600" cy="4754880"/>
                     </a:xfrm>
                     <a:prstGeom prst="rect"/>
                   </pic:spPr>
@@ -2972,7 +2972,7 @@
               <a:graphicData uri="http://schemas.openxmlformats.org/drawingml/2006/picture">
                 <pic:pic>
                   <pic:nvPicPr>
-                    <pic:cNvPr id="0" name="T2QA_compare_1d4699f7e1a3.png"/>
+                    <pic:cNvPr id="0" name="T2QA_compare_2b626016396e.png"/>
                     <pic:cNvPicPr/>
                   </pic:nvPicPr>
                   <pic:blipFill>
@@ -3875,7 +3875,7 @@
       <w:r>
         <w:drawing>
           <wp:inline xmlns:a="http://schemas.openxmlformats.org/drawingml/2006/main" xmlns:pic="http://schemas.openxmlformats.org/drawingml/2006/picture">
-            <wp:extent cx="5943600" cy="4590080"/>
+            <wp:extent cx="5943600" cy="4657620"/>
             <wp:docPr id="3" name="Picture 3"/>
             <wp:cNvGraphicFramePr>
               <a:graphicFrameLocks noChangeAspect="1"/>
@@ -3884,7 +3884,7 @@
               <a:graphicData uri="http://schemas.openxmlformats.org/drawingml/2006/picture">
                 <pic:pic>
                   <pic:nvPicPr>
-                    <pic:cNvPr id="0" name="T2QA_mindmap_e6bc8454ae7b.png"/>
+                    <pic:cNvPr id="0" name="T2QA_mindmap_b46824fb7a61.png"/>
                     <pic:cNvPicPr/>
                   </pic:nvPicPr>
                   <pic:blipFill>
@@ -3896,7 +3896,7 @@
                   <pic:spPr>
                     <a:xfrm>
                       <a:off x="0" y="0"/>
-                      <a:ext cx="5943600" cy="4590080"/>
+                      <a:ext cx="5943600" cy="4657620"/>
                     </a:xfrm>
                     <a:prstGeom prst="rect"/>
                   </pic:spPr>
@@ -5860,7 +5860,7 @@
               <a:graphicData uri="http://schemas.openxmlformats.org/drawingml/2006/picture">
                 <pic:pic>
                   <pic:nvPicPr>
-                    <pic:cNvPr id="0" name="T2QA_pyramid_8ed778570ca2.png"/>
+                    <pic:cNvPr id="0" name="T2QA_pyramid_8023264c2e2b.png"/>
                     <pic:cNvPicPr/>
                   </pic:nvPicPr>
                   <pic:blipFill>
@@ -6298,7 +6298,7 @@
       <w:r>
         <w:drawing>
           <wp:inline xmlns:a="http://schemas.openxmlformats.org/drawingml/2006/main" xmlns:pic="http://schemas.openxmlformats.org/drawingml/2006/picture">
-            <wp:extent cx="5943600" cy="2471997"/>
+            <wp:extent cx="5943600" cy="2539538"/>
             <wp:docPr id="5" name="Picture 5"/>
             <wp:cNvGraphicFramePr>
               <a:graphicFrameLocks noChangeAspect="1"/>
@@ -6307,7 +6307,7 @@
               <a:graphicData uri="http://schemas.openxmlformats.org/drawingml/2006/picture">
                 <pic:pic>
                   <pic:nvPicPr>
-                    <pic:cNvPr id="0" name="T2QA_mindmap_48457b2f6bda.png"/>
+                    <pic:cNvPr id="0" name="T2QA_mindmap_9ea7103222de.png"/>
                     <pic:cNvPicPr/>
                   </pic:nvPicPr>
                   <pic:blipFill>
@@ -6319,7 +6319,7 @@
                   <pic:spPr>
                     <a:xfrm>
                       <a:off x="0" y="0"/>
-                      <a:ext cx="5943600" cy="2471997"/>
+                      <a:ext cx="5943600" cy="2539538"/>
                     </a:xfrm>
                     <a:prstGeom prst="rect"/>
                   </pic:spPr>
@@ -6811,7 +6811,7 @@
               <a:graphicData uri="http://schemas.openxmlformats.org/drawingml/2006/picture">
                 <pic:pic>
                   <pic:nvPicPr>
-                    <pic:cNvPr id="0" name="T2QA_compare_b81badaa1b26.png"/>
+                    <pic:cNvPr id="0" name="T2QA_compare_556fbac15eda.png"/>
                     <pic:cNvPicPr/>
                   </pic:nvPicPr>
                   <pic:blipFill>
@@ -7414,7 +7414,7 @@
       <w:r>
         <w:drawing>
           <wp:inline xmlns:a="http://schemas.openxmlformats.org/drawingml/2006/main" xmlns:pic="http://schemas.openxmlformats.org/drawingml/2006/picture">
-            <wp:extent cx="5943600" cy="4411772"/>
+            <wp:extent cx="5943600" cy="4479312"/>
             <wp:docPr id="7" name="Picture 7"/>
             <wp:cNvGraphicFramePr>
               <a:graphicFrameLocks noChangeAspect="1"/>
@@ -7423,7 +7423,7 @@
               <a:graphicData uri="http://schemas.openxmlformats.org/drawingml/2006/picture">
                 <pic:pic>
                   <pic:nvPicPr>
-                    <pic:cNvPr id="0" name="T2QA_mindmap_5255d5a1b5c8.png"/>
+                    <pic:cNvPr id="0" name="T2QA_mindmap_817f386d34d2.png"/>
                     <pic:cNvPicPr/>
                   </pic:nvPicPr>
                   <pic:blipFill>
@@ -7435,7 +7435,7 @@
                   <pic:spPr>
                     <a:xfrm>
                       <a:off x="0" y="0"/>
-                      <a:ext cx="5943600" cy="4411772"/>
+                      <a:ext cx="5943600" cy="4479312"/>
                     </a:xfrm>
                     <a:prstGeom prst="rect"/>
                   </pic:spPr>
@@ -8176,7 +8176,7 @@
               <a:graphicData uri="http://schemas.openxmlformats.org/drawingml/2006/picture">
                 <pic:pic>
                   <pic:nvPicPr>
-                    <pic:cNvPr id="0" name="T2QA_cycle_0f183af80f0c.png"/>
+                    <pic:cNvPr id="0" name="T2QA_cycle_12302d3fb611.png"/>
                     <pic:cNvPicPr/>
                   </pic:nvPicPr>
                   <pic:blipFill>
@@ -9698,7 +9698,7 @@
       <w:r>
         <w:drawing>
           <wp:inline xmlns:a="http://schemas.openxmlformats.org/drawingml/2006/main" xmlns:pic="http://schemas.openxmlformats.org/drawingml/2006/picture">
-            <wp:extent cx="5943600" cy="4930486"/>
+            <wp:extent cx="5943600" cy="4998027"/>
             <wp:docPr id="9" name="Picture 9"/>
             <wp:cNvGraphicFramePr>
               <a:graphicFrameLocks noChangeAspect="1"/>
@@ -9707,7 +9707,7 @@
               <a:graphicData uri="http://schemas.openxmlformats.org/drawingml/2006/picture">
                 <pic:pic>
                   <pic:nvPicPr>
-                    <pic:cNvPr id="0" name="T2QA_mindmap_3304ec4b499b.png"/>
+                    <pic:cNvPr id="0" name="T2QA_mindmap_a2cf9415121e.png"/>
                     <pic:cNvPicPr/>
                   </pic:nvPicPr>
                   <pic:blipFill>
@@ -9719,7 +9719,7 @@
                   <pic:spPr>
                     <a:xfrm>
                       <a:off x="0" y="0"/>
-                      <a:ext cx="5943600" cy="4930486"/>
+                      <a:ext cx="5943600" cy="4998027"/>
                     </a:xfrm>
                     <a:prstGeom prst="rect"/>
                   </pic:spPr>
@@ -10584,7 +10584,7 @@
               <a:graphicData uri="http://schemas.openxmlformats.org/drawingml/2006/picture">
                 <pic:pic>
                   <pic:nvPicPr>
-                    <pic:cNvPr id="0" name="T2QA_flow_399e4c8b7ddb.png"/>
+                    <pic:cNvPr id="0" name="T2QA_flow_3ea499f836d3.png"/>
                     <pic:cNvPicPr/>
                   </pic:nvPicPr>
                   <pic:blipFill>
@@ -12040,7 +12040,7 @@
       <w:r>
         <w:drawing>
           <wp:inline xmlns:a="http://schemas.openxmlformats.org/drawingml/2006/main" xmlns:pic="http://schemas.openxmlformats.org/drawingml/2006/picture">
-            <wp:extent cx="5943600" cy="4698146"/>
+            <wp:extent cx="5943600" cy="4898067"/>
             <wp:docPr id="11" name="Picture 11"/>
             <wp:cNvGraphicFramePr>
               <a:graphicFrameLocks noChangeAspect="1"/>
@@ -12049,7 +12049,7 @@
               <a:graphicData uri="http://schemas.openxmlformats.org/drawingml/2006/picture">
                 <pic:pic>
                   <pic:nvPicPr>
-                    <pic:cNvPr id="0" name="T2QA_mindmap_6034411d868d.png"/>
+                    <pic:cNvPr id="0" name="T2QA_mindmap_30257c3b629a.png"/>
                     <pic:cNvPicPr/>
                   </pic:nvPicPr>
                   <pic:blipFill>
@@ -12061,7 +12061,7 @@
                   <pic:spPr>
                     <a:xfrm>
                       <a:off x="0" y="0"/>
-                      <a:ext cx="5943600" cy="4698146"/>
+                      <a:ext cx="5943600" cy="4898067"/>
                     </a:xfrm>
                     <a:prstGeom prst="rect"/>
                   </pic:spPr>
@@ -13745,7 +13745,7 @@
               <a:graphicData uri="http://schemas.openxmlformats.org/drawingml/2006/picture">
                 <pic:pic>
                   <pic:nvPicPr>
-                    <pic:cNvPr id="0" name="T2QA_compare_39d0ccc63f46.png"/>
+                    <pic:cNvPr id="0" name="T2QA_compare_80d6b926a456.png"/>
                     <pic:cNvPicPr/>
                   </pic:nvPicPr>
                   <pic:blipFill>
@@ -14281,7 +14281,7 @@
       <w:r>
         <w:drawing>
           <wp:inline xmlns:a="http://schemas.openxmlformats.org/drawingml/2006/main" xmlns:pic="http://schemas.openxmlformats.org/drawingml/2006/picture">
-            <wp:extent cx="5943600" cy="2485505"/>
+            <wp:extent cx="5943600" cy="2553046"/>
             <wp:docPr id="13" name="Picture 13"/>
             <wp:cNvGraphicFramePr>
               <a:graphicFrameLocks noChangeAspect="1"/>
@@ -14290,7 +14290,7 @@
               <a:graphicData uri="http://schemas.openxmlformats.org/drawingml/2006/picture">
                 <pic:pic>
                   <pic:nvPicPr>
-                    <pic:cNvPr id="0" name="T2QA_mindmap_5aa6650172bf.png"/>
+                    <pic:cNvPr id="0" name="T2QA_mindmap_f07557575ce7.png"/>
                     <pic:cNvPicPr/>
                   </pic:nvPicPr>
                   <pic:blipFill>
@@ -14302,7 +14302,7 @@
                   <pic:spPr>
                     <a:xfrm>
                       <a:off x="0" y="0"/>
-                      <a:ext cx="5943600" cy="2485505"/>
+                      <a:ext cx="5943600" cy="2553046"/>
                     </a:xfrm>
                     <a:prstGeom prst="rect"/>
                   </pic:spPr>
@@ -14787,7 +14787,7 @@
               <a:graphicData uri="http://schemas.openxmlformats.org/drawingml/2006/picture">
                 <pic:pic>
                   <pic:nvPicPr>
-                    <pic:cNvPr id="0" name="T2QA_cycle_00e4e1b98b93.png"/>
+                    <pic:cNvPr id="0" name="T2QA_cycle_b70a9a2c7013.png"/>
                     <pic:cNvPicPr/>
                   </pic:nvPicPr>
                   <pic:blipFill>
@@ -15493,7 +15493,7 @@
       <w:r>
         <w:drawing>
           <wp:inline xmlns:a="http://schemas.openxmlformats.org/drawingml/2006/main" xmlns:pic="http://schemas.openxmlformats.org/drawingml/2006/picture">
-            <wp:extent cx="5943600" cy="4957503"/>
+            <wp:extent cx="5943600" cy="5160125"/>
             <wp:docPr id="15" name="Picture 15"/>
             <wp:cNvGraphicFramePr>
               <a:graphicFrameLocks noChangeAspect="1"/>
@@ -15502,7 +15502,7 @@
               <a:graphicData uri="http://schemas.openxmlformats.org/drawingml/2006/picture">
                 <pic:pic>
                   <pic:nvPicPr>
-                    <pic:cNvPr id="0" name="T2QA_mindmap_dcec3cad0867.png"/>
+                    <pic:cNvPr id="0" name="T2QA_mindmap_1474e0321d66.png"/>
                     <pic:cNvPicPr/>
                   </pic:nvPicPr>
                   <pic:blipFill>
@@ -15514,7 +15514,7 @@
                   <pic:spPr>
                     <a:xfrm>
                       <a:off x="0" y="0"/>
-                      <a:ext cx="5943600" cy="4957503"/>
+                      <a:ext cx="5943600" cy="5160125"/>
                     </a:xfrm>
                     <a:prstGeom prst="rect"/>
                   </pic:spPr>
@@ -16049,7 +16049,7 @@
               <a:graphicData uri="http://schemas.openxmlformats.org/drawingml/2006/picture">
                 <pic:pic>
                   <pic:nvPicPr>
-                    <pic:cNvPr id="0" name="T2QA_venn_b2da017f5436.png"/>
+                    <pic:cNvPr id="0" name="T2QA_venn_f416f2996854.png"/>
                     <pic:cNvPicPr/>
                   </pic:nvPicPr>
                   <pic:blipFill>

</xml_diff>